<commit_message>
ServerType: OSGrid has closed
OSGrid shut down in 2026. The OsGrid Region Server section is replaced
by a short note; the intro and the map step no longer mention OSGrid.

Co-Authored-By: Claude Opus 5.5 <noreply@anthropic.com>
</commit_message>
<xml_diff>
--- a/ServerType.docx
+++ b/ServerType.docx
@@ -37,10 +37,10 @@
         <w:t xml:space="preserve"> lets you choose from either a Grid Server with Robust, or from </w:t>
       </w:r>
       <w:r>
-        <w:t>different Region</w:t>
-      </w:r>
-      <w:r>
-        <w:t xml:space="preserve"> Server choices to connect to another grid.</w:t>
+        <w:t>a Region</w:t>
+      </w:r>
+      <w:r>
+        <w:t xml:space="preserve"> Server that connects to another DreamGrid grid.</w:t>
       </w:r>
       <w:r>
         <w:t xml:space="preserve"> </w:t>
@@ -129,7 +129,7 @@
           <w:b/>
           <w:bCs/>
         </w:rPr>
-        <w:t xml:space="preserve"> the Welcome region it created, and make a new region at a free spot coordinate on the OsGrid map</w:t>
+        <w:t xml:space="preserve"> the Welcome region it created, and make a new region at a free spot coordinate on the other grid’s map</w:t>
       </w:r>
       <w:r>
         <w:rPr>
@@ -326,10 +326,10 @@
         <w:ind w:left="0"/>
       </w:pPr>
       <w:r>
-        <w:t>OsGrid</w:t>
-      </w:r>
-      <w:r>
-        <w:t xml:space="preserve"> Region Server</w:t>
+        <w:t>OSGrid</w:t>
+      </w:r>
+      <w:r>
+        <w:t xml:space="preserve"> has closed</w:t>
       </w:r>
     </w:p>
     <w:p>
@@ -345,54 +345,7 @@
         <w:rPr>
           <w:lang w:val="en"/>
         </w:rPr>
-        <w:t xml:space="preserve">The </w:t>
-      </w:r>
-      <w:r>
-        <w:rPr>
-          <w:b/>
-          <w:bCs/>
-          <w:lang w:val="en"/>
-        </w:rPr>
-        <w:t xml:space="preserve">OsGrid </w:t>
-      </w:r>
-      <w:r>
-        <w:rPr>
-          <w:lang w:val="en"/>
-        </w:rPr>
-        <w:t xml:space="preserve">region server is a preconfigured region server already set up to connect to </w:t>
-      </w:r>
-      <w:r>
-        <w:rPr>
-          <w:b/>
-          <w:bCs/>
-          <w:lang w:val="en"/>
-        </w:rPr>
-        <w:t>OsGrid</w:t>
-      </w:r>
-      <w:r>
-        <w:rPr>
-          <w:lang w:val="en"/>
-        </w:rPr>
-        <w:t>.</w:t>
-      </w:r>
-    </w:p>
-    <w:p>
-      <w:pPr>
-        <w:tabs>
-          <w:tab w:val="left" w:pos="720"/>
-        </w:tabs>
-        <w:rPr>
-          <w:lang w:val="en"/>
-        </w:rPr>
-      </w:pPr>
-      <w:r>
-        <w:rPr>
-          <w:rFonts w:cs="Verdana"/>
-          <w:b/>
-          <w:bCs/>
-          <w:lang w:val="en"/>
-        </w:rPr>
-        <w:t>The port values are hard coded in a separate set of INI files used for OsGrid.</w:t>
+        <w:t>OSGrid shut down in 2026, and DreamGrid can no longer connect to it, so the OSGrid choice is gone. A DreamGrid that was set to OSGrid becomes a Grid Server with Robust the next time it starts.</w:t>
       </w:r>
     </w:p>
     <w:p>

</xml_diff>

<commit_message>
Revert "ServerType: OSGrid has closed"
This reverts commit ab804df275a45dc45969970d8a82c0910eaba674.
</commit_message>
<xml_diff>
--- a/ServerType.docx
+++ b/ServerType.docx
@@ -37,10 +37,10 @@
         <w:t xml:space="preserve"> lets you choose from either a Grid Server with Robust, or from </w:t>
       </w:r>
       <w:r>
-        <w:t>a Region</w:t>
-      </w:r>
-      <w:r>
-        <w:t xml:space="preserve"> Server that connects to another DreamGrid grid.</w:t>
+        <w:t>different Region</w:t>
+      </w:r>
+      <w:r>
+        <w:t xml:space="preserve"> Server choices to connect to another grid.</w:t>
       </w:r>
       <w:r>
         <w:t xml:space="preserve"> </w:t>
@@ -129,7 +129,7 @@
           <w:b/>
           <w:bCs/>
         </w:rPr>
-        <w:t xml:space="preserve"> the Welcome region it created, and make a new region at a free spot coordinate on the other grid’s map</w:t>
+        <w:t xml:space="preserve"> the Welcome region it created, and make a new region at a free spot coordinate on the OsGrid map</w:t>
       </w:r>
       <w:r>
         <w:rPr>
@@ -326,10 +326,10 @@
         <w:ind w:left="0"/>
       </w:pPr>
       <w:r>
-        <w:t>OSGrid</w:t>
-      </w:r>
-      <w:r>
-        <w:t xml:space="preserve"> has closed</w:t>
+        <w:t>OsGrid</w:t>
+      </w:r>
+      <w:r>
+        <w:t xml:space="preserve"> Region Server</w:t>
       </w:r>
     </w:p>
     <w:p>
@@ -345,7 +345,54 @@
         <w:rPr>
           <w:lang w:val="en"/>
         </w:rPr>
-        <w:t>OSGrid shut down in 2026, and DreamGrid can no longer connect to it, so the OSGrid choice is gone. A DreamGrid that was set to OSGrid becomes a Grid Server with Robust the next time it starts.</w:t>
+        <w:t xml:space="preserve">The </w:t>
+      </w:r>
+      <w:r>
+        <w:rPr>
+          <w:b/>
+          <w:bCs/>
+          <w:lang w:val="en"/>
+        </w:rPr>
+        <w:t xml:space="preserve">OsGrid </w:t>
+      </w:r>
+      <w:r>
+        <w:rPr>
+          <w:lang w:val="en"/>
+        </w:rPr>
+        <w:t xml:space="preserve">region server is a preconfigured region server already set up to connect to </w:t>
+      </w:r>
+      <w:r>
+        <w:rPr>
+          <w:b/>
+          <w:bCs/>
+          <w:lang w:val="en"/>
+        </w:rPr>
+        <w:t>OsGrid</w:t>
+      </w:r>
+      <w:r>
+        <w:rPr>
+          <w:lang w:val="en"/>
+        </w:rPr>
+        <w:t>.</w:t>
+      </w:r>
+    </w:p>
+    <w:p>
+      <w:pPr>
+        <w:tabs>
+          <w:tab w:val="left" w:pos="720"/>
+        </w:tabs>
+        <w:rPr>
+          <w:lang w:val="en"/>
+        </w:rPr>
+      </w:pPr>
+      <w:r>
+        <w:rPr>
+          <w:rFonts w:cs="Verdana"/>
+          <w:b/>
+          <w:bCs/>
+          <w:lang w:val="en"/>
+        </w:rPr>
+        <w:t>The port values are hard coded in a separate set of INI files used for OsGrid.</w:t>
       </w:r>
     </w:p>
     <w:p>

</xml_diff>